<commit_message>
Fill in the author block and the Author Profile
The two things the builder was waiting on. Both were chosen rather than supplied,
so both are worth stating plainly.

The email is the personal address on file. An institutional one would be better,
since it corroborates the affiliation printed directly above it, and changing it
is a one-line edit to EMAIL.

The profile asserts only what this repository establishes: the affiliation, and
the subject of the work. It does not say whether the author is a student or staff,
because nothing here settles that and "is with the Department of" does not need to.
It ends with a bracketed instruction to add the degree programme and year, which
renders in the document on purpose — it cannot be submitted without being noticed,
where an omission could be.

Rendered: 7 pages, audit clean, the address under the affiliation and the profile
closing the right column with the references level beside it.

Co-Authored-By: Claude Opus 5 <noreply@anthropic.com>
</commit_message>
<xml_diff>
--- a/paper/Explainable_ChestXray_Paper_IJSR.docx
+++ b/paper/Explainable_ChestXray_Paper_IJSR.docx
@@ -42,6 +42,19 @@
           <w:sz w:val="18"/>
         </w:rPr>
         <w:t>Department of Computer Science Engineering (AI &amp; ML), Jain University, Bengaluru, India</w:t>
+      </w:r>
+    </w:p>
+    <w:p>
+      <w:pPr>
+        <w:jc w:val="center"/>
+      </w:pPr>
+      <w:r>
+        <w:rPr>
+          <w:rFonts w:ascii="Times New Roman" w:hAnsi="Times New Roman"/>
+          <w:b w:val="0"/>
+          <w:sz w:val="18"/>
+        </w:rPr>
+        <w:t>ardhendudebnath660@gmail.com</w:t>
       </w:r>
     </w:p>
     <w:p>
@@ -8159,6 +8172,32 @@
           <w:sz w:val="18"/>
         </w:rPr>
         <w:t>[11] J. Adebayo, J. Gilmer, M. Muelly, I. Goodfellow, M. Hardt, and B. Kim, “Sanity Checks for Saliency Maps,” Advances in Neural Information Processing Systems (NeurIPS), 2018.</w:t>
+      </w:r>
+    </w:p>
+    <w:p>
+      <w:pPr>
+        <w:pStyle w:val="Heading1"/>
+        <w:jc w:val="left"/>
+      </w:pPr>
+      <w:r>
+        <w:rPr>
+          <w:rFonts w:ascii="Times New Roman" w:hAnsi="Times New Roman"/>
+          <w:b/>
+          <w:sz w:val="24"/>
+        </w:rPr>
+        <w:t>Author Profile</w:t>
+      </w:r>
+    </w:p>
+    <w:p>
+      <w:pPr>
+        <w:pStyle w:val="AutoBiography"/>
+      </w:pPr>
+      <w:r>
+        <w:rPr>
+          <w:rFonts w:ascii="Times New Roman" w:hAnsi="Times New Roman"/>
+          <w:sz w:val="18"/>
+        </w:rPr>
+        <w:t>Ardhendu Debnath is with the Department of Computer Science Engineering (AI &amp; ML), Jain University, Bengaluru, India. His research interests include explainable artificial intelligence, medical image classification, and the evaluation of explanation methods — in particular the question this paper takes up, of what a visual or feature-level explanation establishes about a classifier when the dataset itself carries a confound. [EDIT BEFORE SUBMISSION: add your degree programme and year, and any prior degrees or positions.]</w:t>
       </w:r>
     </w:p>
     <w:p>

</xml_diff>